<commit_message>
docs: fill author/affiliation, drop AI-use disclosure section
Author byline set to Yerzat Mametayev, Nazarbayev Intellectual School of
Physics and Mathematics in Semey, Semey, Kazakhstan (given-name-first per
MDPI byline convention) across both RU and EN MDPI docx and the markdown.
Removed the AI-use disclosure section per author request. Both docx
regenerated and XSD-valid (RU 457 / EN 462 paragraphs).
</commit_message>
<xml_diff>
--- a/docs/PAPER_MDPI.en.docx
+++ b/docs/PAPER_MDPI.en.docx
@@ -77,7 +77,7 @@
           <w:sz w:val="22"/>
           <w:szCs w:val="22"/>
         </w:rPr>
-        <w:t xml:space="preserve">[Surname Given-name]</w:t>
+        <w:t xml:space="preserve">Yerzat Mametayev</w:t>
       </w:r>
       <w:r>
         <w:rPr>
@@ -109,7 +109,7 @@
           <w:sz w:val="16"/>
           <w:szCs w:val="16"/>
         </w:rPr>
-        <w:t xml:space="preserve">  [Institution], [City], [Country]</w:t>
+        <w:t xml:space="preserve">  Nazarbayev Intellectual School of Physics and Mathematics in Semey, Semey, Kazakhstan</w:t>
       </w:r>
     </w:p>
     <w:p>
@@ -6708,36 +6708,6 @@
           <w:szCs w:val="19"/>
         </w:rPr>
         <w:t xml:space="preserve">The benchmark and three-axis validation give a way to tell cascade models apart in a statistically honest manner. Next: grow N via chokepoint events (IMF PortWatch transit data sidesteps the aggregate-dilution problem); calibrate magnitudes on the 405-node ICIO graph; a demand-side mechanism for 2008–09-type events; and releasing the benchmark as an open standard for third-party models.</w:t>
-      </w:r>
-    </w:p>
-    <w:p>
-      <w:pPr>
-        <w:spacing w:after="40" w:before="100"/>
-      </w:pPr>
-      <w:r>
-        <w:rPr>
-          <w:rFonts w:ascii="Palatino Linotype" w:cs="Palatino Linotype" w:eastAsia="Palatino Linotype" w:hAnsi="Palatino Linotype"/>
-          <w:b/>
-          <w:bCs/>
-          <w:color w:val="1A1A1A"/>
-          <w:sz w:val="18"/>
-          <w:szCs w:val="18"/>
-        </w:rPr>
-        <w:t xml:space="preserve">AI-use disclosure and acknowledgements</w:t>
-      </w:r>
-    </w:p>
-    <w:p>
-      <w:pPr>
-        <w:spacing w:after="20" w:line="240"/>
-        <w:jc w:val="both"/>
-      </w:pPr>
-      <w:r>
-        <w:rPr>
-          <w:rFonts w:ascii="Palatino Linotype" w:cs="Palatino Linotype" w:eastAsia="Palatino Linotype" w:hAnsi="Palatino Linotype"/>
-          <w:sz w:val="19"/>
-          <w:szCs w:val="19"/>
-        </w:rPr>
-        <w:t xml:space="preserve">Engineering implementation, statistical processing and documentation drafting used an AI assistant (Claude Code, Anthropic) under the author's direction; problem framing, data-inclusion decisions, mechanism accept/reject calls at the gates, and the final text are the author's. All data come from open primary sources listed line-by-line in the repository CSVs.</w:t>
       </w:r>
     </w:p>
     <w:p>

</xml_diff>

<commit_message>
fix: refresh Sobol sensitivity to N=27 - two params dominate, not one
The N=27 Sobol re-run (SALib) landed with materially different indices
than the 2026-05 snapshot the paper had quoted: recovery_rate ST 0.913 ->
0.617 and inventory_scale 0.270 -> 0.592, i.e. TWO strongly-interacting
parameters now carry the variance (S1 0.39/0.42 << ST, sum ST ~1.30),
not one. The earlier "one identifiable, ranking stable across N" claim was
wrong at N=27 and is corrected in §6.7 of PAPER.ru.md and both MDPI docx;
sobol.json updated. Conclusion still holds (3 of 5 params non-identifiable
individually; corroborates the 6.6 over-parameterization finding), but now
on correct numbers. Both docx XSD-valid.
</commit_message>
<xml_diff>
--- a/docs/PAPER_MDPI.en.docx
+++ b/docs/PAPER_MDPI.en.docx
@@ -5693,7 +5693,7 @@
           <w:sz w:val="19"/>
           <w:szCs w:val="19"/>
         </w:rPr>
-        <w:t xml:space="preserve">A variance-based Sobol sensitivity analysis (1536 engine runs, output mean_industry_loss_MAE — Table 6) asks whether the five parameters are identifiable; the ranking is stable across event-set size. Of the five, only one is truly identifiable — recovery_rate, carrying ~91% of output variance; inventory_scale acts only through interactions and two parameters are negligible and can be fixed. This independently corroborates §6.6 (the model is over-complex relative to what the N=27 data can constrain) and explains why per-fold recalibration (§6.4) so easily masks structural edits: almost all fitting freedom lives in one parameter. (MCMC at 350 steps did not converge, r̂=2.03; Bayesian intervals are left to a longer future run.)</w:t>
+        <w:t xml:space="preserve">A variance-based Sobol sensitivity analysis (1536 engine runs, output mean_industry_loss_MAE, N=27 — Table 6) asks whether the five parameters are identifiable. Two parameters carry the output variance — recovery_rate (ST 0.62) and inventory_scale (ST 0.59) — and their low first-order indices (S1 0.39 and 0.42) against high total effects signal strong interaction between them (ST sum ≈ 1.30 ≫ 1); two parameters are negligible and can be fixed, and one is minor. Thus three of five parameters are effectively non-identifiable individually, with the fitting freedom concentrated in a strongly-coupled (recovery_rate, inventory_scale) pair. This independently corroborates §6.6 (the model is over-complex relative to what the N=27 data can constrain) and explains why per-fold recalibration (§6.4) so easily masks structural edits. (MCMC at 350 steps did not converge, r̂=2.03; Bayesian intervals are left to a longer future run.)</w:t>
       </w:r>
     </w:p>
     <w:p>
@@ -5729,7 +5729,7 @@
           <w:sz w:val="16"/>
           <w:szCs w:val="16"/>
         </w:rPr>
-        <w:t xml:space="preserve"> Sobol sensitivity indices: total effect ST and first-order S1 for the five parameters.</w:t>
+        <w:t xml:space="preserve"> Sobol sensitivity indices (N=27): total effect ST and first-order S1 for the five parameters.</w:t>
       </w:r>
     </w:p>
     <w:tbl>
@@ -5929,7 +5929,7 @@
                 <w:sz w:val="16"/>
                 <w:szCs w:val="16"/>
               </w:rPr>
-              <w:t xml:space="preserve">0.913</w:t>
+              <w:t xml:space="preserve">0.617</w:t>
             </w:r>
           </w:p>
         </w:tc>
@@ -5954,7 +5954,7 @@
                 <w:sz w:val="16"/>
                 <w:szCs w:val="16"/>
               </w:rPr>
-              <w:t xml:space="preserve">0.771</w:t>
+              <w:t xml:space="preserve">0.392</w:t>
             </w:r>
           </w:p>
         </w:tc>
@@ -5979,7 +5979,7 @@
                 <w:sz w:val="16"/>
                 <w:szCs w:val="16"/>
               </w:rPr>
-              <w:t xml:space="preserve">dominates</w:t>
+              <w:t xml:space="preserve">variance + interactions</w:t>
             </w:r>
           </w:p>
         </w:tc>
@@ -6034,7 +6034,7 @@
                 <w:sz w:val="16"/>
                 <w:szCs w:val="16"/>
               </w:rPr>
-              <w:t xml:space="preserve">0.270</w:t>
+              <w:t xml:space="preserve">0.592</w:t>
             </w:r>
           </w:p>
         </w:tc>
@@ -6059,7 +6059,7 @@
                 <w:sz w:val="16"/>
                 <w:szCs w:val="16"/>
               </w:rPr>
-              <w:t xml:space="preserve">≈0</w:t>
+              <w:t xml:space="preserve">0.416</w:t>
             </w:r>
           </w:p>
         </w:tc>
@@ -6084,7 +6084,7 @@
                 <w:sz w:val="16"/>
                 <w:szCs w:val="16"/>
               </w:rPr>
-              <w:t xml:space="preserve">interactions only</w:t>
+              <w:t xml:space="preserve">variance + interactions</w:t>
             </w:r>
           </w:p>
         </w:tc>
@@ -6139,7 +6139,7 @@
                 <w:sz w:val="16"/>
                 <w:szCs w:val="16"/>
               </w:rPr>
-              <w:t xml:space="preserve">0.039</w:t>
+              <w:t xml:space="preserve">0.077</w:t>
             </w:r>
           </w:p>
         </w:tc>
@@ -6164,7 +6164,7 @@
                 <w:sz w:val="16"/>
                 <w:szCs w:val="16"/>
               </w:rPr>
-              <w:t xml:space="preserve">≈0</w:t>
+              <w:t xml:space="preserve">0.011</w:t>
             </w:r>
           </w:p>
         </w:tc>
@@ -6189,7 +6189,7 @@
                 <w:sz w:val="16"/>
                 <w:szCs w:val="16"/>
               </w:rPr>
-              <w:t xml:space="preserve">moderate</w:t>
+              <w:t xml:space="preserve">minor</w:t>
             </w:r>
           </w:p>
         </w:tc>
@@ -6244,7 +6244,7 @@
                 <w:sz w:val="16"/>
                 <w:szCs w:val="16"/>
               </w:rPr>
-              <w:t xml:space="preserve">0.005</w:t>
+              <w:t xml:space="preserve">0.010</w:t>
             </w:r>
           </w:p>
         </w:tc>
@@ -6269,7 +6269,7 @@
                 <w:sz w:val="16"/>
                 <w:szCs w:val="16"/>
               </w:rPr>
-              <w:t xml:space="preserve">0.003</w:t>
+              <w:t xml:space="preserve">0.002</w:t>
             </w:r>
           </w:p>
         </w:tc>

</xml_diff>

<commit_message>
docs: remove placeholder journal masthead from both MDPI docx
Dropped the top masthead line ("[Journal Name] · working preprint ·
Open Access") per author request - it was a placeholder for a journal
not yet chosen. Cleaned the same "[Journal Name]" placeholder from the
page footer for consistency (kept the green rule and page numbers). The
document now opens with the green "Article"/"Статья" label. Both docx
XSD-valid.
</commit_message>
<xml_diff>
--- a/docs/PAPER_MDPI.en.docx
+++ b/docs/PAPER_MDPI.en.docx
@@ -2,39 +2,6 @@
 <file path=word/document.xml><?xml version="1.0" encoding="utf-8"?>
 <w:document xmlns:wpc="http://schemas.microsoft.com/office/word/2010/wordprocessingCanvas" xmlns:mc="http://schemas.openxmlformats.org/markup-compatibility/2006" xmlns:o="urn:schemas-microsoft-com:office:office" xmlns:r="http://schemas.openxmlformats.org/officeDocument/2006/relationships" xmlns:m="http://schemas.openxmlformats.org/officeDocument/2006/math" xmlns:v="urn:schemas-microsoft-com:vml" xmlns:wp14="http://schemas.microsoft.com/office/word/2010/wordprocessingDrawing" xmlns:wp="http://schemas.openxmlformats.org/drawingml/2006/wordprocessingDrawing" xmlns:w10="urn:schemas-microsoft-com:office:word" xmlns:w="http://schemas.openxmlformats.org/wordprocessingml/2006/main" xmlns:w14="http://schemas.microsoft.com/office/word/2010/wordml" xmlns:w15="http://schemas.microsoft.com/office/word/2012/wordml" xmlns:wpg="http://schemas.microsoft.com/office/word/2010/wordprocessingGroup" xmlns:wpi="http://schemas.microsoft.com/office/word/2010/wordprocessingInk" xmlns:wne="http://schemas.microsoft.com/office/word/2006/wordml" xmlns:wps="http://schemas.microsoft.com/office/word/2010/wordprocessingShape" xmlns:cx="http://schemas.microsoft.com/office/drawing/2014/chartex" xmlns:cx1="http://schemas.microsoft.com/office/drawing/2015/9/8/chartex" xmlns:cx2="http://schemas.microsoft.com/office/drawing/2015/10/21/chartex" xmlns:cx3="http://schemas.microsoft.com/office/drawing/2016/5/9/chartex" xmlns:cx4="http://schemas.microsoft.com/office/drawing/2016/5/10/chartex" xmlns:cx5="http://schemas.microsoft.com/office/drawing/2016/5/11/chartex" xmlns:cx6="http://schemas.microsoft.com/office/drawing/2016/5/12/chartex" xmlns:cx7="http://schemas.microsoft.com/office/drawing/2016/5/13/chartex" xmlns:cx8="http://schemas.microsoft.com/office/drawing/2016/5/14/chartex" xmlns:aink="http://schemas.microsoft.com/office/drawing/2016/ink" xmlns:am3d="http://schemas.microsoft.com/office/drawing/2017/model3d" xmlns:w16cex="http://schemas.microsoft.com/office/word/2018/wordml/cex" xmlns:w16cid="http://schemas.microsoft.com/office/word/2016/wordml/cid" xmlns:w16="http://schemas.microsoft.com/office/word/2018/wordml" xmlns:w16sdtdh="http://schemas.microsoft.com/office/word/2020/wordml/sdtdatahash" xmlns:w16se="http://schemas.microsoft.com/office/word/2015/wordml/symex" mc:Ignorable="w14 w15 wp14">
   <w:body>
-    <w:p>
-      <w:pPr>
-        <w:pBdr>
-          <w:bottom w:val="single" w:color="0E7C3A" w:sz="18" w:space="6"/>
-        </w:pBdr>
-        <w:tabs>
-          <w:tab w:val="right" w:pos="9638"/>
-        </w:tabs>
-        <w:spacing w:after="40"/>
-      </w:pPr>
-      <w:r>
-        <w:rPr>
-          <w:rFonts w:ascii="Palatino Linotype" w:cs="Palatino Linotype" w:eastAsia="Palatino Linotype" w:hAnsi="Palatino Linotype"/>
-          <w:i/>
-          <w:iCs/>
-          <w:color w:val="595959"/>
-          <w:sz w:val="16"/>
-          <w:szCs w:val="16"/>
-        </w:rPr>
-        <w:t xml:space="preserve">[Journal Name] · working preprint</w:t>
-      </w:r>
-      <w:r>
-        <w:rPr>
-          <w:rFonts w:ascii="Palatino Linotype" w:cs="Palatino Linotype" w:eastAsia="Palatino Linotype" w:hAnsi="Palatino Linotype"/>
-          <w:b/>
-          <w:bCs/>
-          <w:color w:val="0E7C3A"/>
-          <w:sz w:val="16"/>
-          <w:szCs w:val="16"/>
-        </w:rPr>
-        <w:t xml:space="preserve">	Open Access</w:t>
-      </w:r>
-    </w:p>
     <w:p>
       <w:pPr>
         <w:spacing w:after="40" w:before="120"/>

</xml_diff>

<commit_message>
docs: test count 147 -> 149 across paper and both builders
Two tests were added with the censoring fix and the count was not carried through.
Caught by running the suite against what the paper claims rather than trusting it.

Both docx rebuilt and XSD-validated.
</commit_message>
<xml_diff>
--- a/docs/PAPER_MDPI.en.docx
+++ b/docs/PAPER_MDPI.en.docx
@@ -9995,7 +9995,7 @@
           <w:sz w:val="19"/>
           <w:szCs w:val="19"/>
         </w:rPr>
-        <w:t xml:space="preserve">The engine configuration is pinned (fixed seeds, stochasticity off); results are frozen by golden tests, and any numeric change is an explicit diff in the same commit. The statistical layer is deterministic (seed 20260718). The headline-numbers document and all figures are generated by scripts from artifacts; each figure ships with its numeric table. 147 automated tests, all green. Exact commands are in Appendix B.</w:t>
+        <w:t xml:space="preserve">The engine configuration is pinned (fixed seeds, stochasticity off); results are frozen by golden tests, and any numeric change is an explicit diff in the same commit. The statistical layer is deterministic (seed 20260718). The headline-numbers document and all figures are generated by scripts from artifacts; each figure ships with its numeric table. 149 automated tests, all green. Exact commands are in Appendix B.</w:t>
       </w:r>
     </w:p>
     <w:p>
@@ -15696,7 +15696,7 @@
                 <w:sz w:val="16"/>
                 <w:szCs w:val="16"/>
               </w:rPr>
-              <w:t xml:space="preserve">python -m pytest                              # 147 tests, all green</w:t>
+              <w:t xml:space="preserve">python -m pytest                              # 149 tests, all green</w:t>
             </w:r>
           </w:p>
         </w:tc>

</xml_diff>